<commit_message>
Malachi 2nd re-audit (Sep 24): KO 1:12-13 full rewrite + EN repetition restore + slang cleanup
- KO ch1 idx14 [12-13]: was near-duplicate of idx10 (v7-8 content), not a
  translation of EN v12-13 ('All except you... you profane me'). Rewrote KO
  fully from EN/MSG.
- EN ch1 idx12 [10]: restored MSG repetition 'I am not pleased. The
  God-of-the-Angel-Armies is not pleased.' (was collapsed to once).
- Slang cleanup (meaning kept): EN '411'/'Dude'/'btw'/'no cap'/'Yo, check it'/
  'bam'/'Yo, for real'; KO '이딴'/'까발리는'/'징징대면서'/'살피셈'/'야, 봐봐'/'기대하셈'.
- completeness_check residual 7 all false positives (documented).
- Gates: STRUCT OK, rows=44 msg_units=32 teen_without_msg=0 msg_orphans=0
  VERIFY_DROPPED=0, DOCX rows inspected, Google Docs re-uploaded 4/4 tables,
  export-back VERIFIED OK. No push (local only).
</commit_message>
<xml_diff>
--- a/gdocs_build/Malachi.docx
+++ b/gdocs_build/Malachi.docx
@@ -124,7 +124,7 @@
               <w:rPr>
                 <w:sz w:val="18"/>
               </w:rPr>
-              <w:t>Alright, so here's the 411. God has a message for the people of Israel, and he's delivering it through his prophet, Malachi.</w:t>
+              <w:t>Alright, so here's the deal. God has a message for the people of Israel, and he's delivering it through his prophet, Malachi.</w:t>
             </w:r>
           </w:p>
         </w:tc>
@@ -353,7 +353,7 @@
               <w:rPr>
                 <w:sz w:val="18"/>
               </w:rPr>
-              <w:t>God's reply is basically, "Dude, just look at history. See how differently I treated your ancestor Jacob compared to his brother Esau? I chose Jacob and rejected Esau. I flattened show-off Esau into a molehill and turned his whole country into a ghost town."</w:t>
+              <w:t>God's reply is basically, "Just look at history. See how differently I treated your ancestor Jacob compared to his brother Esau? I chose Jacob and rejected Esau. I flattened show-off Esau into a molehill and turned his whole country into a ghost town."</w:t>
             </w:r>
           </w:p>
         </w:tc>
@@ -1024,7 +1024,7 @@
               <w:rPr>
                 <w:sz w:val="18"/>
               </w:rPr>
-              <w:t>"Honestly, I wish one of you would just lock the Temple doors so you can't come in and play these fake religious games with your silly, empty-headed worship. I'm not happy," says the LORD of Heaven's Armies. "And I don't want any more of your so-called worship!"</w:t>
+              <w:t>"Honestly, I wish one of you would just lock the Temple doors so you can't come in and play these fake religious games with your silly, empty-headed worship. I'm not happy. The LORD of Heaven's Armies is not happy. "And I don't want any more of your so-called worship!"</w:t>
             </w:r>
           </w:p>
         </w:tc>
@@ -1047,7 +1047,7 @@
               <w:rPr>
                 <w:sz w:val="18"/>
               </w:rPr>
-              <w:t>"너네 중 한 명이 그냥 성전 문 닫고 잠가버리지 그러냐? 그럼 아무도 들어와서 이딴 바보 같고 생각 없는 예배로 종교놀이 못 할 거 아냐. 나 기분 안 좋음. 만군의 주 하나님은 기분 안 좋으심. 그리고 이딴 소위 '예배'는 더 이상 받고 싶지 않아!"</w:t>
+              <w:t>"너네 중 한 명이 그냥 성전 문 닫고 잠가버리지 그러냐? 그럼 아무도 들어와서 이런 바보 같고 생각 없는 예배로 종교놀이 못 할 거 아냐. 나 기분 안 좋음. 만군의 주 하나님은 기분 안 좋으심. 그리고 이런 소위 '예배'는 더 이상 받고 싶지 않아!"</w:t>
             </w:r>
           </w:p>
         </w:tc>
@@ -1189,7 +1189,7 @@
               <w:rPr>
                 <w:sz w:val="18"/>
               </w:rPr>
-              <w:t>"'하나님 제단은 이제 별로 안 중요해. 하나님 예배는 이제 우선순위가 아니야'라고 말할 때, 그게 더러운 거야. 그리고 예배 때 제물로 쓸모없는 동물들, 너네가 없애버리고 싶어 하는 눈 멀고 병들고 다리 저는 동물들을 바칠 때, 그게 더러운 거 아니냐? 그런 짓을 너네 총독한테 한번 해봐라. 그게 먹힐 것 같냐?" 만군의 주 하나님이 물으신다.</w:t>
+              <w:t>“근데 너네는 아니야. 나를 존경하기는커녕 무시하고 있잖아. '예배는 그냥 대충하면 되고, 뭘 가져오는지는 중요하지 않아'라고 말할 때, 그리고 '아, 너무 지루해. 나한테는 하나도 도움 안 돼'라고 불평할 때 그러는 거야. 너네는 잘난 척하면서 콧대를 높이지—나, 만군의 주 하나님 앞에서! 그리고 가져오기는 하는데, 다 남이 쓰던 거나 고장 난 거, 쓸모없는 것들이야. 내가 그걸 받을 것 같아? 이건 하나님이 너네한테 똑바로 말하는 거야!”</w:t>
             </w:r>
           </w:p>
         </w:tc>
@@ -1383,7 +1383,7 @@
               <w:rPr>
                 <w:sz w:val="18"/>
               </w:rPr>
-              <w:t>Alright, priests, listen up. This one's for you. If you don't start listening to me and giving me the respect I deserve—I'm the God of Angel Armies, btw—then I'm gonna curse you. All those blessings you have? Yeah, they're turning into curses. Actually, it's already happening because you're not taking me seriously. And this curse is gonna hit your kids too. I'm gonna smear nasty, rotten trash from your own parties all over your faces. Have fun with that.</w:t>
+              <w:t>Alright, priests, listen up. This one's for you. If you don't start listening to me and giving me the respect I deserve—I'm the God of Angel Armies—then I'm gonna curse you. All those blessings you have? Yeah, they're turning into curses. Actually, it's already happening because you're not taking me seriously. And this curse is gonna hit your kids too. I'm gonna smear nasty, rotten trash from your own parties all over your faces. Have fun with that.</w:t>
             </w:r>
           </w:p>
         </w:tc>
@@ -1454,7 +1454,7 @@
               <w:rPr>
                 <w:sz w:val="18"/>
               </w:rPr>
-              <w:t>Maybe that'll finally get your attention. Maybe then you'll get that I'm calling you out to breathe new life into my covenant with the priests of Levi. That was a promise from the God of Angel Armies, you know? My deal with Levi was all about life and peace. I kept my end of the bargain, and he respected me for it. He was genuinely in awe of me. He taught the truth, no cap. He walked with me in peace, always doing the right thing. He saved a ton of people from messing up their lives.</w:t>
+              <w:t>Maybe that'll finally get your attention. Maybe then you'll get that I'm calling you out to breathe new life into my covenant with the priests of Levi. That was a promise from the God of Angel Armies, you know? My deal with Levi was all about life and peace. I kept my end of the bargain, and he respected me for it. He was genuinely in awe of me. He taught the truth—no lies, ever. He walked with me in peace, always doing the right thing. He saved a ton of people from messing up their lives.</w:t>
             </w:r>
           </w:p>
         </w:tc>
@@ -1548,7 +1548,7 @@
               <w:rPr>
                 <w:sz w:val="18"/>
               </w:rPr>
-              <w:t>제사장의 역할은 진리를 가르치는 거임. 사람들은 당연히 그들한테서 가르침을 구해야 하고. 제사장은 만군의 주 하나님의 메신저니까. 근데 너네 제사장들은 그 길을 버렸음. 너네의 가르침이 많은 사람들의 인생을 망쳐놨다고. 너네가 레위와 맺은 언약을 깨버린 거임. 만군의 주 하나님이 직접 하시는 말씀임. 그래서 내가 너네의 정체를 싹 다 까발리는 중인 거. 모든 사람이 너네를 역겨워하고 피하게 될 거다. 왜냐하면 너네는 내가 시킨 대로 살지도 않고, 내 계시를 공정하고 진실되게 가르치지도 않으니까.</w:t>
+              <w:t>제사장의 역할은 진리를 가르치는 거임. 사람들은 당연히 그들한테서 가르침을 구해야 하고. 제사장은 만군의 주 하나님의 메신저니까. 근데 너네 제사장들은 그 길을 버렸음. 너네의 가르침이 많은 사람들의 인생을 망쳐놨다고. 너네가 레위와 맺은 언약을 깨버린 거임. 만군의 주 하나님이 직접 하시는 말씀임. 그래서 내가 너네의 정체가 뭔지 낱낱이 드러내는 중인 거. 모든 사람이 너네를 역겨워하고 피하게 될 거다. 왜냐하면 너네는 내가 시킨 대로 살지도 않고, 내 계시를 공정하고 진실되게 가르치지도 않으니까.</w:t>
             </w:r>
           </w:p>
         </w:tc>
@@ -1761,7 +1761,7 @@
               <w:rPr>
                 <w:sz w:val="18"/>
               </w:rPr>
-              <w:t>그리고 두 번째 잘못이 있음. 너네는 하나님한테 원하는 걸 얻지 못한다고 징징대면서 성전을 눈물바다로 만들고 있음. 왜 그런지 앎? 간단함. 하나님은 너네가 어린 시절에 맞이한 신부와 결혼 서약을 할 때 증인으로 계셨음. 근데 지금 너네는 그 서약을 깨고, 너네의 언약의 아내, 동반자와의 신의를 저버렸다고. 결혼은 너네가 아니라 하나님이 만드신 거임. 그의 영은 결혼의 아주 작은 디테일 하나하나에까지 깃들어 있다고. 그리고 하나님이 결혼을 통해 원하시는 게 뭘까? 바로 하나님의 자녀들임. 그러니까 너네 안에 있는 결혼의 영을 잘 지키셈. 배우자 배신하지 마.</w:t>
+              <w:t>그리고 두 번째 잘못이 있음. 너네는 하나님한테 원하는 걸 얻지 못한다고 투덜대면서 성전을 눈물바다로 만들고 있음. 왜 그런지 앎? 간단함. 하나님은 너네가 어린 시절에 맞이한 신부와 결혼 서약을 할 때 증인으로 계셨음. 근데 지금 너네는 그 서약을 깨고, 너네의 언약의 아내, 동반자와의 신의를 저버렸다고. 결혼은 너네가 아니라 하나님이 만드신 거임. 그의 영은 결혼의 아주 작은 디테일 하나하나에까지 깃들어 있다고. 그리고 하나님이 결혼을 통해 원하시는 게 뭘까? 바로 하나님의 자녀들임. 그러니까 너네 안에 있는 결혼의 영을 잘 지키셈. 배우자 배신하지 마.</w:t>
             </w:r>
           </w:p>
         </w:tc>
@@ -1832,7 +1832,7 @@
               <w:rPr>
                 <w:sz w:val="18"/>
               </w:rPr>
-              <w:t>"나는 이혼을 싫어한다." 이스라엘의 하나님이 말씀하셨음. 만군의 주 하나님이 말씀하시길, "나는 결혼으로 '한 몸'이 된 것을 폭력적으로 찢어놓는 것을 증오한다." 그러니 너네 자신을 잘 살피셈. 방심하지 말고, 배신하지 마.</w:t>
+              <w:t>"나는 이혼을 싫어한다." 이스라엘의 하나님이 말씀하셨음. 만군의 주 하나님이 말씀하시길, "나는 결혼으로 '한 몸'이 된 것을 폭력적으로 찢어놓는 것을 증오한다." 그러니 너네 자신을 잘 살펴. 방심하지 말고, 배신하지 마.</w:t>
             </w:r>
           </w:p>
         </w:tc>
@@ -2184,7 +2184,7 @@
               <w:rPr>
                 <w:sz w:val="18"/>
               </w:rPr>
-              <w:t>“Yo, check it! I’m sending my messenger ahead to clear the path for me. Then, bam, out of nowhere, the Leader you’ve been looking for will just show up in his Temple—yep, the Messenger of the Covenant you’ve all been waiting for. Look! He’s on his way!” This is a direct message from the God-of-the-Angel-Armies.</w:t>
+              <w:t>“Look! I’m sending my messenger ahead to clear the path for me. Then, suddenly, out of nowhere, the Leader you’ve been looking for will just show up in his Temple—yep, the Messenger of the Covenant you’ve all been waiting for. Look! He’s on his way!” This is a direct message from the God-of-the-Angel-Armies.</w:t>
             </w:r>
           </w:p>
         </w:tc>
@@ -2207,7 +2207,7 @@
               <w:rPr>
                 <w:sz w:val="18"/>
               </w:rPr>
-              <w:t>“야, 봐봐! 내가 내 메신저를 먼저 보내서 길을 준비시킬 거래. 그러다 갑자기, 너네가 그렇게 찾던 그분이 자기 성전에 나타나실 거임. 맞아, 너네가 기다리던 언약의 메신저 말이야. 봐봐! 그분이 오고 계신대!” 이건 만군의 주 하나님이 직접 하신 말씀임.</w:t>
+              <w:t>“봐봐! 내가 내 메신저를 먼저 보내서 길을 준비시킬 거래. 그러다 갑자기, 너네가 그렇게 찾던 그분이 자기 성전에 나타나실 거임. 맞아, 너네가 기다리던 언약의 메신저 말이야. 봐봐! 그분이 오고 계신대!” 이건 만군의 주 하나님이 직접 하신 말씀임.</w:t>
             </w:r>
           </w:p>
         </w:tc>
@@ -3364,7 +3364,7 @@
               <w:rPr>
                 <w:sz w:val="18"/>
               </w:rPr>
-              <w:t>Yo, for real, a day is coming that's gonna be like a massive wildfire. All the proud, evil people? They're gonna get torched like kindling, totally burnt up. Nothing left but scorched earth and ash. It's gonna be a dark day for them. But for you guys who respect my name? It's gonna be like a sunrise. The sun of justice will rise, with healing radiating from its wings. You'll be super energetic, like a young horse just let out to play. And you'll totally crush the wicked—they'll be like dust under your feet on that day. The God of Angel Armies says so.</w:t>
+              <w:t>Count on it: a day is coming that's gonna be like a massive wildfire. All the proud, evil people? They're gonna get torched like kindling, totally burnt up. Nothing left but scorched earth and ash. It's gonna be a dark day for them. But for you guys who respect my name? It's gonna be like a sunrise. The sun of justice will rise, with healing radiating from its wings. You'll be super energetic, like a young horse just let out to play. And you'll totally crush the wicked—they'll be like dust under your feet on that day. The God of Angel Armies says so.</w:t>
             </w:r>
           </w:p>
         </w:tc>
@@ -3529,7 +3529,7 @@
               <w:rPr>
                 <w:sz w:val="18"/>
               </w:rPr>
-              <w:t>근데 앞날도 기대하셈. 내가 선지자 엘리야를 보내서 하나님의 그 엄청난 날, 어마어마한 심판의 날을 준비시킬 거임! 엘리야가 부모들한테는 자식들을 돌보게 하고, 자식들한테는 부모를 존경하게 할 거래. 만약 그들이 거절하면, 내가 와서 그 땅을 저주해 버릴 거임.</w:t>
+              <w:t>근데 앞으로 올 일도 준비해. 내가 선지자 엘리야를 보내서 하나님의 그 엄청난 날, 어마어마한 심판의 날을 준비시킬 거임! 엘리야가 부모들한테는 자식들을 돌보게 하고, 자식들한테는 부모를 존경하게 할 거래. 만약 그들이 거절하면, 내가 와서 그 땅을 저주해 버릴 거임.</w:t>
             </w:r>
           </w:p>
         </w:tc>

</xml_diff>